<commit_message>
update Announcement and add in notes for Standards
</commit_message>
<xml_diff>
--- a/documents/state-documents/New-Academic-Degree-Program-Summary-for-Program-Announcement.docx
+++ b/documents/state-documents/New-Academic-Degree-Program-Summary-for-Program-Announcement.docx
@@ -119,7 +119,7 @@
           <w:p>
             <w:pPr>
               <w:pStyle w:val="Normal"/>
-              <w:overflowPunct w:val="true"/>
+              <w:overflowPunct w:val="false"/>
               <w:spacing w:lineRule="exact" w:line="251"/>
               <w:rPr>
                 <w:rFonts w:ascii="Times New Roman" w:hAnsi="Times New Roman" w:eastAsia="Times New Roman" w:cs="Times New Roman"/>
@@ -156,7 +156,7 @@
           <w:p>
             <w:pPr>
               <w:pStyle w:val="Normal"/>
-              <w:overflowPunct w:val="true"/>
+              <w:overflowPunct w:val="false"/>
               <w:rPr>
                 <w:rFonts w:ascii="Times New Roman" w:hAnsi="Times New Roman" w:eastAsia="Times New Roman" w:cs="Times New Roman"/>
               </w:rPr>
@@ -215,7 +215,7 @@
           <w:p>
             <w:pPr>
               <w:pStyle w:val="Normal"/>
-              <w:overflowPunct w:val="true"/>
+              <w:overflowPunct w:val="false"/>
               <w:spacing w:lineRule="exact" w:line="251"/>
               <w:rPr>
                 <w:rFonts w:ascii="Times New Roman" w:hAnsi="Times New Roman" w:eastAsia="Times New Roman" w:cs="Times New Roman"/>
@@ -282,7 +282,7 @@
           <w:p>
             <w:pPr>
               <w:pStyle w:val="Normal"/>
-              <w:overflowPunct w:val="true"/>
+              <w:overflowPunct w:val="false"/>
               <w:rPr>
                 <w:rFonts w:ascii="Times New Roman" w:hAnsi="Times New Roman" w:eastAsia="Times New Roman" w:cs="Times New Roman"/>
               </w:rPr>
@@ -341,7 +341,7 @@
           <w:p>
             <w:pPr>
               <w:pStyle w:val="Normal"/>
-              <w:overflowPunct w:val="true"/>
+              <w:overflowPunct w:val="false"/>
               <w:spacing w:lineRule="exact" w:line="253"/>
               <w:rPr>
                 <w:rFonts w:ascii="Times New Roman" w:hAnsi="Times New Roman" w:eastAsia="Times New Roman" w:cs="Times New Roman"/>
@@ -395,7 +395,7 @@
           <w:p>
             <w:pPr>
               <w:pStyle w:val="Normal"/>
-              <w:overflowPunct w:val="true"/>
+              <w:overflowPunct w:val="false"/>
               <w:rPr>
                 <w:rFonts w:ascii="Times New Roman" w:hAnsi="Times New Roman" w:eastAsia="Times New Roman" w:cs="Times New Roman"/>
               </w:rPr>
@@ -454,7 +454,7 @@
           <w:p>
             <w:pPr>
               <w:pStyle w:val="Normal"/>
-              <w:overflowPunct w:val="true"/>
+              <w:overflowPunct w:val="false"/>
               <w:spacing w:lineRule="exact" w:line="251"/>
               <w:rPr>
                 <w:rFonts w:ascii="Times New Roman" w:hAnsi="Times New Roman" w:eastAsia="Times New Roman" w:cs="Times New Roman"/>
@@ -508,7 +508,7 @@
           <w:p>
             <w:pPr>
               <w:pStyle w:val="Normal"/>
-              <w:overflowPunct w:val="true"/>
+              <w:overflowPunct w:val="false"/>
               <w:rPr>
                 <w:rFonts w:ascii="Times New Roman" w:hAnsi="Times New Roman" w:eastAsia="Times New Roman" w:cs="Times New Roman"/>
               </w:rPr>
@@ -721,6 +721,157 @@
         <w:pStyle w:val="NoSpacing"/>
         <w:rPr>
           <w:rFonts w:ascii="Times New Roman" w:hAnsi="Times New Roman" w:cs="Times New Roman"/>
+          <w:b w:val="false"/>
+          <w:bCs w:val="false"/>
+          <w:i w:val="false"/>
+          <w:iCs w:val="false"/>
+          <w:sz w:val="24"/>
+          <w:szCs w:val="24"/>
+          <w:u w:val="none"/>
+        </w:rPr>
+      </w:pPr>
+      <w:r>
+        <w:rPr>
+          <w:rFonts w:cs="Times New Roman" w:ascii="Times New Roman" w:hAnsi="Times New Roman"/>
+          <w:b w:val="false"/>
+          <w:bCs w:val="false"/>
+          <w:i w:val="false"/>
+          <w:iCs w:val="false"/>
+          <w:sz w:val="24"/>
+          <w:szCs w:val="24"/>
+          <w:u w:val="none"/>
+        </w:rPr>
+        <w:t xml:space="preserve">The transition to the GRID program is the result of a comprehensive strategic redesign of three previously distinct programs: Game Design, Game Art, and Interface Design &amp; Web Development. As the interactive media landscape evolves, the boundaries between these disciplines are increasingly blurred; modern industry workflows require a high degree of convergence between technical programming, aesthetic artistry, and user experience design. Current student feedback polling </w:t>
+      </w:r>
+      <w:r>
+        <w:rPr>
+          <w:rFonts w:cs="Times New Roman" w:ascii="Times New Roman" w:hAnsi="Times New Roman"/>
+          <w:b w:val="false"/>
+          <w:bCs w:val="false"/>
+          <w:i w:val="false"/>
+          <w:iCs w:val="false"/>
+          <w:sz w:val="24"/>
+          <w:szCs w:val="24"/>
+          <w:u w:val="none"/>
+        </w:rPr>
+        <w:t>and industry needs</w:t>
+      </w:r>
+      <w:r>
+        <w:rPr>
+          <w:rFonts w:cs="Times New Roman" w:ascii="Times New Roman" w:hAnsi="Times New Roman"/>
+          <w:b w:val="false"/>
+          <w:bCs w:val="false"/>
+          <w:i w:val="false"/>
+          <w:iCs w:val="false"/>
+          <w:sz w:val="24"/>
+          <w:szCs w:val="24"/>
+          <w:u w:val="none"/>
+        </w:rPr>
+        <w:t xml:space="preserve"> indicate a strong desire to engage with </w:t>
+      </w:r>
+      <w:r>
+        <w:rPr>
+          <w:rFonts w:cs="Times New Roman" w:ascii="Times New Roman" w:hAnsi="Times New Roman"/>
+          <w:b w:val="false"/>
+          <w:bCs w:val="false"/>
+          <w:i w:val="false"/>
+          <w:iCs w:val="false"/>
+          <w:sz w:val="24"/>
+          <w:szCs w:val="24"/>
+          <w:u w:val="none"/>
+        </w:rPr>
+        <w:t>learning skills</w:t>
+      </w:r>
+      <w:r>
+        <w:rPr>
+          <w:rFonts w:cs="Times New Roman" w:ascii="Times New Roman" w:hAnsi="Times New Roman"/>
+          <w:b w:val="false"/>
+          <w:bCs w:val="false"/>
+          <w:i w:val="false"/>
+          <w:iCs w:val="false"/>
+          <w:sz w:val="24"/>
+          <w:szCs w:val="24"/>
+          <w:u w:val="none"/>
+        </w:rPr>
+        <w:t xml:space="preserve"> across these three domains. However, under the previous </w:t>
+      </w:r>
+      <w:r>
+        <w:rPr>
+          <w:rFonts w:cs="Times New Roman" w:ascii="Times New Roman" w:hAnsi="Times New Roman"/>
+          <w:b w:val="false"/>
+          <w:bCs w:val="false"/>
+          <w:i w:val="false"/>
+          <w:iCs w:val="false"/>
+          <w:sz w:val="24"/>
+          <w:szCs w:val="24"/>
+          <w:u w:val="none"/>
+        </w:rPr>
+        <w:t>separate</w:t>
+      </w:r>
+      <w:r>
+        <w:rPr>
+          <w:rFonts w:cs="Times New Roman" w:ascii="Times New Roman" w:hAnsi="Times New Roman"/>
+          <w:b w:val="false"/>
+          <w:bCs w:val="false"/>
+          <w:i w:val="false"/>
+          <w:iCs w:val="false"/>
+          <w:sz w:val="24"/>
+          <w:szCs w:val="24"/>
+          <w:u w:val="none"/>
+        </w:rPr>
+        <w:t xml:space="preserve"> </w:t>
+      </w:r>
+      <w:r>
+        <w:rPr>
+          <w:rFonts w:cs="Times New Roman" w:ascii="Times New Roman" w:hAnsi="Times New Roman"/>
+          <w:b w:val="false"/>
+          <w:bCs w:val="false"/>
+          <w:i w:val="false"/>
+          <w:iCs w:val="false"/>
+          <w:sz w:val="24"/>
+          <w:szCs w:val="24"/>
+          <w:u w:val="none"/>
+        </w:rPr>
+        <w:t>program</w:t>
+      </w:r>
+      <w:r>
+        <w:rPr>
+          <w:rFonts w:cs="Times New Roman" w:ascii="Times New Roman" w:hAnsi="Times New Roman"/>
+          <w:b w:val="false"/>
+          <w:bCs w:val="false"/>
+          <w:i w:val="false"/>
+          <w:iCs w:val="false"/>
+          <w:sz w:val="24"/>
+          <w:szCs w:val="24"/>
+          <w:u w:val="none"/>
+        </w:rPr>
+        <w:t xml:space="preserve"> structure, existing credit limits and rigid curricular boundaries prevented students from pursuing this interdisciplinary breadth. By consolidating these programs into GRID, we eliminate these structural barriers, allowing for a unified curriculum that mirrors industry convergence and provides students the academic flexibility to cultivate a truly multifaceted skill set.</w:t>
+      </w:r>
+    </w:p>
+    <w:p>
+      <w:pPr>
+        <w:pStyle w:val="NoSpacing"/>
+        <w:rPr>
+          <w:rFonts w:ascii="Times New Roman" w:hAnsi="Times New Roman" w:cs="Times New Roman"/>
+          <w:sz w:val="24"/>
+          <w:szCs w:val="24"/>
+          <w:u w:val="single"/>
+        </w:rPr>
+      </w:pPr>
+      <w:r>
+        <w:rPr>
+          <w:rFonts w:cs="Times New Roman" w:ascii="Times New Roman" w:hAnsi="Times New Roman"/>
+          <w:sz w:val="24"/>
+          <w:szCs w:val="24"/>
+          <w:u w:val="single"/>
+        </w:rPr>
+      </w:r>
+    </w:p>
+    <w:p>
+      <w:pPr>
+        <w:pStyle w:val="NoSpacing"/>
+        <w:rPr>
+          <w:rFonts w:ascii="Times New Roman" w:hAnsi="Times New Roman" w:cs="Times New Roman"/>
           <w:sz w:val="24"/>
           <w:szCs w:val="24"/>
           <w:u w:val="single"/>
@@ -778,81 +929,15 @@
           <w:sz w:val="24"/>
           <w:szCs w:val="24"/>
         </w:rPr>
-        <w:t xml:space="preserve">The </w:t>
-      </w:r>
-      <w:r>
-        <w:rPr>
-          <w:rFonts w:cs="Times New Roman" w:ascii="Times New Roman" w:hAnsi="Times New Roman"/>
-          <w:b/>
-          <w:bCs/>
-          <w:sz w:val="24"/>
-          <w:szCs w:val="24"/>
-        </w:rPr>
-        <w:t xml:space="preserve">Program </w:t>
-      </w:r>
-      <w:r>
-        <w:rPr>
-          <w:rFonts w:cs="Times New Roman" w:ascii="Times New Roman" w:hAnsi="Times New Roman"/>
-          <w:b/>
-          <w:bCs/>
-          <w:sz w:val="24"/>
-          <w:szCs w:val="24"/>
-        </w:rPr>
-        <w:t>Learning</w:t>
-      </w:r>
-      <w:r>
-        <w:rPr>
-          <w:rFonts w:cs="Times New Roman" w:ascii="Times New Roman" w:hAnsi="Times New Roman"/>
-          <w:b/>
-          <w:bCs/>
-          <w:sz w:val="24"/>
-          <w:szCs w:val="24"/>
-        </w:rPr>
-        <w:t xml:space="preserve"> </w:t>
-      </w:r>
-      <w:r>
-        <w:rPr>
-          <w:rFonts w:cs="Times New Roman" w:ascii="Times New Roman" w:hAnsi="Times New Roman"/>
-          <w:b/>
-          <w:bCs/>
-          <w:sz w:val="24"/>
-          <w:szCs w:val="24"/>
-        </w:rPr>
-        <w:t>O</w:t>
-      </w:r>
-      <w:r>
-        <w:rPr>
-          <w:rFonts w:cs="Times New Roman" w:ascii="Times New Roman" w:hAnsi="Times New Roman"/>
-          <w:b/>
-          <w:bCs/>
-          <w:sz w:val="24"/>
-          <w:szCs w:val="24"/>
-        </w:rPr>
-        <w:t>bjectives</w:t>
-      </w:r>
-      <w:r>
-        <w:rPr>
-          <w:rFonts w:cs="Times New Roman" w:ascii="Times New Roman" w:hAnsi="Times New Roman"/>
-          <w:sz w:val="24"/>
-          <w:szCs w:val="24"/>
-        </w:rPr>
-        <w:t xml:space="preserve"> </w:t>
-      </w:r>
-      <w:r>
-        <w:rPr>
-          <w:rFonts w:cs="Times New Roman" w:ascii="Times New Roman" w:hAnsi="Times New Roman"/>
-          <w:sz w:val="24"/>
-          <w:szCs w:val="24"/>
-        </w:rPr>
-        <w:t xml:space="preserve">(below) </w:t>
-      </w:r>
-      <w:r>
-        <w:rPr>
-          <w:rFonts w:cs="Times New Roman" w:ascii="Times New Roman" w:hAnsi="Times New Roman"/>
-          <w:sz w:val="24"/>
-          <w:szCs w:val="24"/>
-        </w:rPr>
-        <w:t>focus on interactive experience design, technical proficiency, problem-solving, and collaborative teamwork, assessed through varied methods:</w:t>
+        <w:t>The Program Learning Objectives</w:t>
+      </w:r>
+      <w:r>
+        <w:rPr>
+          <w:rFonts w:cs="Times New Roman" w:ascii="Times New Roman" w:hAnsi="Times New Roman"/>
+          <w:sz w:val="24"/>
+          <w:szCs w:val="24"/>
+        </w:rPr>
+        <w:t xml:space="preserve"> (below) focus on interactive experience design, technical proficiency, problem-solving, and collaborative teamwork, assessed through varied methods:</w:t>
       </w:r>
     </w:p>
     <w:p>
@@ -1145,42 +1230,333 @@
           <w:sz w:val="24"/>
           <w:szCs w:val="24"/>
         </w:rPr>
-        <w:t>A robust enrollment plan includes targeted outreach, transfer agreements, and flexible scheduling, while continuous program improvement will be ensured through regular curriculum reviews, feedback mechanisms, and engagement with industry experts. The program is committed to fostering equity, accessibility, and affordability, and will proactively monitor student progress to address any barriers to success via mentoring touchstones built into the curriculum.</w:t>
-      </w:r>
-    </w:p>
-    <w:p>
-      <w:pPr>
-        <w:pStyle w:val="NoSpacing"/>
-        <w:rPr>
-          <w:rFonts w:ascii="Times New Roman" w:hAnsi="Times New Roman" w:cs="Times New Roman"/>
-          <w:sz w:val="24"/>
-          <w:szCs w:val="24"/>
-        </w:rPr>
-      </w:pPr>
-      <w:r>
-        <w:rPr>
-          <w:rFonts w:cs="Times New Roman" w:ascii="Times New Roman" w:hAnsi="Times New Roman"/>
-          <w:sz w:val="24"/>
-          <w:szCs w:val="24"/>
-        </w:rPr>
-      </w:r>
-    </w:p>
-    <w:p>
-      <w:pPr>
-        <w:pStyle w:val="NoSpacing"/>
-        <w:rPr>
-          <w:rFonts w:ascii="Times New Roman" w:hAnsi="Times New Roman" w:cs="Times New Roman"/>
-          <w:sz w:val="24"/>
-          <w:szCs w:val="24"/>
-        </w:rPr>
-      </w:pPr>
-      <w:r>
-        <w:rPr>
-          <w:rFonts w:cs="Times New Roman" w:ascii="Times New Roman" w:hAnsi="Times New Roman"/>
-          <w:sz w:val="24"/>
-          <w:szCs w:val="24"/>
-        </w:rPr>
-        <w:t xml:space="preserve">The program will also be supported by two labs in the southern part of the Arts Building, and their existing resources. GRID Lab 1 sports a Motion Capture suite and extensive gaming library of physical board, card, and paper games, as well as digital gaming consoles and VR headsets; where GRID Lab 2 sports a dual-projector classroom designed to teach coding, and a User Experience development and testing workspace. Both labs have industry standard software for developing graphic and motion assets (Adobe and related packages) as well as game design programming and development software such as Unity alongside Open Source alternatives. </w:t>
+        <w:t>T</w:t>
+      </w:r>
+      <w:r>
+        <w:rPr>
+          <w:rFonts w:cs="Times New Roman" w:ascii="Times New Roman" w:hAnsi="Times New Roman"/>
+          <w:sz w:val="24"/>
+          <w:szCs w:val="24"/>
+        </w:rPr>
+        <w:t xml:space="preserve">he curriculum </w:t>
+      </w:r>
+      <w:r>
+        <w:rPr>
+          <w:rFonts w:cs="Times New Roman" w:ascii="Times New Roman" w:hAnsi="Times New Roman"/>
+          <w:sz w:val="24"/>
+          <w:szCs w:val="24"/>
+        </w:rPr>
+        <w:t>also</w:t>
+      </w:r>
+      <w:r>
+        <w:rPr>
+          <w:rFonts w:cs="Times New Roman" w:ascii="Times New Roman" w:hAnsi="Times New Roman"/>
+          <w:sz w:val="24"/>
+          <w:szCs w:val="24"/>
+        </w:rPr>
+        <w:t xml:space="preserve"> features </w:t>
+      </w:r>
+      <w:r>
+        <w:rPr>
+          <w:rFonts w:cs="Times New Roman" w:ascii="Times New Roman" w:hAnsi="Times New Roman"/>
+          <w:sz w:val="24"/>
+          <w:szCs w:val="24"/>
+        </w:rPr>
+        <w:t>a unique series of</w:t>
+      </w:r>
+      <w:r>
+        <w:rPr>
+          <w:rFonts w:cs="Times New Roman" w:ascii="Times New Roman" w:hAnsi="Times New Roman"/>
+          <w:sz w:val="24"/>
+          <w:szCs w:val="24"/>
+        </w:rPr>
+        <w:t xml:space="preserve"> three 1-credit “mentoring touchstone” </w:t>
+      </w:r>
+      <w:r>
+        <w:rPr>
+          <w:rFonts w:cs="Times New Roman" w:ascii="Times New Roman" w:hAnsi="Times New Roman"/>
+          <w:sz w:val="24"/>
+          <w:szCs w:val="24"/>
+        </w:rPr>
+        <w:t>classes</w:t>
+      </w:r>
+      <w:r>
+        <w:rPr>
+          <w:rFonts w:cs="Times New Roman" w:ascii="Times New Roman" w:hAnsi="Times New Roman"/>
+          <w:sz w:val="24"/>
+          <w:szCs w:val="24"/>
+        </w:rPr>
+        <w:t xml:space="preserve"> designed to reduce barriers to achievement </w:t>
+      </w:r>
+      <w:r>
+        <w:rPr>
+          <w:rFonts w:cs="Times New Roman" w:ascii="Times New Roman" w:hAnsi="Times New Roman"/>
+          <w:sz w:val="24"/>
+          <w:szCs w:val="24"/>
+        </w:rPr>
+        <w:t>and are taken at crucial milestones during their course of study</w:t>
+      </w:r>
+      <w:r>
+        <w:rPr>
+          <w:rFonts w:cs="Times New Roman" w:ascii="Times New Roman" w:hAnsi="Times New Roman"/>
+          <w:sz w:val="24"/>
+          <w:szCs w:val="24"/>
+        </w:rPr>
+        <w:t>:</w:t>
+      </w:r>
+    </w:p>
+    <w:p>
+      <w:pPr>
+        <w:pStyle w:val="NoSpacing"/>
+        <w:rPr>
+          <w:rFonts w:ascii="Times New Roman" w:hAnsi="Times New Roman" w:cs="Times New Roman"/>
+          <w:sz w:val="24"/>
+          <w:szCs w:val="24"/>
+        </w:rPr>
+      </w:pPr>
+      <w:r>
+        <w:rPr>
+          <w:rFonts w:cs="Times New Roman" w:ascii="Times New Roman" w:hAnsi="Times New Roman"/>
+          <w:sz w:val="24"/>
+          <w:szCs w:val="24"/>
+        </w:rPr>
+      </w:r>
+    </w:p>
+    <w:p>
+      <w:pPr>
+        <w:pStyle w:val="NoSpacing"/>
+        <w:numPr>
+          <w:ilvl w:val="0"/>
+          <w:numId w:val="2"/>
+        </w:numPr>
+        <w:rPr>
+          <w:rFonts w:ascii="Times New Roman" w:hAnsi="Times New Roman" w:cs="Times New Roman"/>
+          <w:sz w:val="24"/>
+          <w:szCs w:val="24"/>
+        </w:rPr>
+      </w:pPr>
+      <w:r>
+        <w:rPr>
+          <w:rFonts w:cs="Times New Roman" w:ascii="Times New Roman" w:hAnsi="Times New Roman"/>
+          <w:b/>
+          <w:bCs/>
+          <w:sz w:val="24"/>
+          <w:szCs w:val="24"/>
+        </w:rPr>
+        <w:t>GRID 105 - Introduction to GRID:</w:t>
+      </w:r>
+      <w:r>
+        <w:rPr>
+          <w:rFonts w:cs="Times New Roman" w:ascii="Times New Roman" w:hAnsi="Times New Roman"/>
+          <w:sz w:val="24"/>
+          <w:szCs w:val="24"/>
+        </w:rPr>
+        <w:t xml:space="preserve"> Establishes foundational industry knowledge and faculty-led academic planning </w:t>
+      </w:r>
+      <w:r>
+        <w:rPr>
+          <w:rFonts w:cs="Times New Roman" w:ascii="Times New Roman" w:hAnsi="Times New Roman"/>
+          <w:sz w:val="24"/>
+          <w:szCs w:val="24"/>
+        </w:rPr>
+        <w:t>and is taken in the first semester.</w:t>
+      </w:r>
+    </w:p>
+    <w:p>
+      <w:pPr>
+        <w:pStyle w:val="NoSpacing"/>
+        <w:numPr>
+          <w:ilvl w:val="0"/>
+          <w:numId w:val="2"/>
+        </w:numPr>
+        <w:rPr>
+          <w:rFonts w:ascii="Times New Roman" w:hAnsi="Times New Roman" w:cs="Times New Roman"/>
+          <w:sz w:val="24"/>
+          <w:szCs w:val="24"/>
+        </w:rPr>
+      </w:pPr>
+      <w:r>
+        <w:rPr>
+          <w:rFonts w:cs="Times New Roman" w:ascii="Times New Roman" w:hAnsi="Times New Roman"/>
+          <w:b/>
+          <w:bCs/>
+          <w:sz w:val="24"/>
+          <w:szCs w:val="24"/>
+        </w:rPr>
+        <w:t xml:space="preserve">GRID 210 - Current Issues in GRID: </w:t>
+      </w:r>
+      <w:r>
+        <w:rPr>
+          <w:rFonts w:cs="Times New Roman" w:ascii="Times New Roman" w:hAnsi="Times New Roman"/>
+          <w:sz w:val="24"/>
+          <w:szCs w:val="24"/>
+        </w:rPr>
+        <w:t xml:space="preserve">Develops critical analysis of emerging technologies and ethical standards, </w:t>
+      </w:r>
+      <w:r>
+        <w:rPr>
+          <w:rFonts w:cs="Times New Roman" w:ascii="Times New Roman" w:hAnsi="Times New Roman"/>
+          <w:sz w:val="24"/>
+          <w:szCs w:val="24"/>
+        </w:rPr>
+        <w:t>which is taken in the final semester along with:</w:t>
+      </w:r>
+    </w:p>
+    <w:p>
+      <w:pPr>
+        <w:pStyle w:val="NoSpacing"/>
+        <w:numPr>
+          <w:ilvl w:val="0"/>
+          <w:numId w:val="2"/>
+        </w:numPr>
+        <w:rPr>
+          <w:rFonts w:ascii="Times New Roman" w:hAnsi="Times New Roman" w:cs="Times New Roman"/>
+          <w:sz w:val="24"/>
+          <w:szCs w:val="24"/>
+        </w:rPr>
+      </w:pPr>
+      <w:r>
+        <w:rPr>
+          <w:rFonts w:cs="Times New Roman" w:ascii="Times New Roman" w:hAnsi="Times New Roman"/>
+          <w:b/>
+          <w:bCs/>
+          <w:sz w:val="24"/>
+          <w:szCs w:val="24"/>
+        </w:rPr>
+        <w:t>GRID 299 - Digital Portfolio:</w:t>
+      </w:r>
+      <w:r>
+        <w:rPr>
+          <w:rFonts w:cs="Times New Roman" w:ascii="Times New Roman" w:hAnsi="Times New Roman"/>
+          <w:sz w:val="24"/>
+          <w:szCs w:val="24"/>
+        </w:rPr>
+        <w:t xml:space="preserve"> </w:t>
+      </w:r>
+      <w:r>
+        <w:rPr>
+          <w:rFonts w:cs="Times New Roman" w:ascii="Times New Roman" w:hAnsi="Times New Roman"/>
+          <w:sz w:val="24"/>
+          <w:szCs w:val="24"/>
+        </w:rPr>
+        <w:t>which fa</w:t>
+      </w:r>
+      <w:r>
+        <w:rPr>
+          <w:rFonts w:cs="Times New Roman" w:ascii="Times New Roman" w:hAnsi="Times New Roman"/>
+          <w:sz w:val="24"/>
+          <w:szCs w:val="24"/>
+        </w:rPr>
+        <w:t>cilitates professional readiness through the curation of industry-standard digital assets.</w:t>
+      </w:r>
+    </w:p>
+    <w:p>
+      <w:pPr>
+        <w:pStyle w:val="NoSpacing"/>
+        <w:rPr>
+          <w:rFonts w:ascii="Times New Roman" w:hAnsi="Times New Roman" w:cs="Times New Roman"/>
+          <w:sz w:val="24"/>
+          <w:szCs w:val="24"/>
+        </w:rPr>
+      </w:pPr>
+      <w:r>
+        <w:rPr>
+          <w:rFonts w:cs="Times New Roman" w:ascii="Times New Roman" w:hAnsi="Times New Roman"/>
+          <w:b/>
+          <w:bCs/>
+          <w:sz w:val="24"/>
+          <w:szCs w:val="24"/>
+        </w:rPr>
+      </w:r>
+    </w:p>
+    <w:p>
+      <w:pPr>
+        <w:pStyle w:val="NoSpacing"/>
+        <w:rPr>
+          <w:rFonts w:ascii="Times New Roman" w:hAnsi="Times New Roman" w:cs="Times New Roman"/>
+          <w:sz w:val="24"/>
+          <w:szCs w:val="24"/>
+        </w:rPr>
+      </w:pPr>
+      <w:r>
+        <w:rPr>
+          <w:rFonts w:cs="Times New Roman" w:ascii="Times New Roman" w:hAnsi="Times New Roman"/>
+          <w:sz w:val="24"/>
+          <w:szCs w:val="24"/>
+        </w:rPr>
+        <w:t>Furthermore, the</w:t>
+      </w:r>
+      <w:r>
+        <w:rPr>
+          <w:rFonts w:cs="Times New Roman" w:ascii="Times New Roman" w:hAnsi="Times New Roman"/>
+          <w:sz w:val="24"/>
+          <w:szCs w:val="24"/>
+        </w:rPr>
+        <w:t xml:space="preserve"> program will be supported by </w:t>
+      </w:r>
+      <w:r>
+        <w:rPr>
+          <w:rFonts w:cs="Times New Roman" w:ascii="Times New Roman" w:hAnsi="Times New Roman"/>
+          <w:sz w:val="24"/>
+          <w:szCs w:val="24"/>
+        </w:rPr>
+        <w:t xml:space="preserve">three full-time faculty who each specialize in the domains of </w:t>
+      </w:r>
+      <w:r>
+        <w:rPr>
+          <w:rFonts w:cs="Times New Roman" w:ascii="Times New Roman" w:hAnsi="Times New Roman"/>
+          <w:sz w:val="24"/>
+          <w:szCs w:val="24"/>
+        </w:rPr>
+        <w:t>game design,</w:t>
+      </w:r>
+      <w:r>
+        <w:rPr>
+          <w:rFonts w:cs="Times New Roman" w:ascii="Times New Roman" w:hAnsi="Times New Roman"/>
+          <w:sz w:val="24"/>
+          <w:szCs w:val="24"/>
+        </w:rPr>
+        <w:t xml:space="preserve"> software engineering, digital artistry, and user experience design, </w:t>
+      </w:r>
+      <w:r>
+        <w:rPr>
+          <w:rFonts w:cs="Times New Roman" w:ascii="Times New Roman" w:hAnsi="Times New Roman"/>
+          <w:sz w:val="24"/>
+          <w:szCs w:val="24"/>
+        </w:rPr>
+        <w:t>with classes taught in</w:t>
+      </w:r>
+      <w:r>
+        <w:rPr>
+          <w:rFonts w:cs="Times New Roman" w:ascii="Times New Roman" w:hAnsi="Times New Roman"/>
+          <w:sz w:val="24"/>
+          <w:szCs w:val="24"/>
+        </w:rPr>
+        <w:t xml:space="preserve"> </w:t>
+      </w:r>
+      <w:r>
+        <w:rPr>
+          <w:rFonts w:cs="Times New Roman" w:ascii="Times New Roman" w:hAnsi="Times New Roman"/>
+          <w:sz w:val="24"/>
+          <w:szCs w:val="24"/>
+        </w:rPr>
+        <w:t xml:space="preserve">two </w:t>
+      </w:r>
+      <w:r>
+        <w:rPr>
+          <w:rFonts w:cs="Times New Roman" w:ascii="Times New Roman" w:hAnsi="Times New Roman"/>
+          <w:sz w:val="24"/>
+          <w:szCs w:val="24"/>
+        </w:rPr>
+        <w:t>fully outfitted</w:t>
+      </w:r>
+      <w:r>
+        <w:rPr>
+          <w:rFonts w:cs="Times New Roman" w:ascii="Times New Roman" w:hAnsi="Times New Roman"/>
+          <w:sz w:val="24"/>
+          <w:szCs w:val="24"/>
+        </w:rPr>
+        <w:t xml:space="preserve"> labs in the southern part of the Arts Building. GRID Lab 1 sports a Motion Capture suite and extensive gaming library of physical board, card, and paper games, as well as digital gaming consoles and VR headsets; where GRID Lab 2 sports a dual-projector classroom designed to teach coding, and a User Experience development and testing workspace. Both labs have industry standard software for developing graphic and motion assets (Adobe and related packages) as well as game design programming and development software such as Unity, alongside Open Source alternatives.</w:t>
       </w:r>
     </w:p>
     <w:p>
@@ -1318,15 +1694,13 @@
           <w:szCs w:val="24"/>
         </w:rPr>
       </w:pPr>
-      <w:hyperlink r:id="rId2">
-        <w:r>
-          <w:rPr>
-            <w:rFonts w:cs="Times New Roman" w:ascii="Times New Roman" w:hAnsi="Times New Roman"/>
-            <w:sz w:val="24"/>
-            <w:szCs w:val="24"/>
-          </w:rPr>
-        </w:r>
-      </w:hyperlink>
+      <w:r>
+        <w:rPr>
+          <w:rFonts w:cs="Times New Roman" w:ascii="Times New Roman" w:hAnsi="Times New Roman"/>
+          <w:sz w:val="24"/>
+          <w:szCs w:val="24"/>
+        </w:rPr>
+      </w:r>
     </w:p>
     <w:p>
       <w:pPr>
@@ -1347,7 +1721,15 @@
           <w:sz w:val="24"/>
           <w:szCs w:val="24"/>
         </w:rPr>
-        <w:t>15-1252 (Software Developers) — +19% projected change</w:t>
+        <w:t xml:space="preserve">15-1252 (Software Developers) — </w:t>
+      </w:r>
+      <w:r>
+        <w:rPr>
+          <w:rFonts w:cs="Times New Roman" w:ascii="Times New Roman" w:hAnsi="Times New Roman"/>
+          <w:sz w:val="24"/>
+          <w:szCs w:val="24"/>
+        </w:rPr>
+        <w:t>+19.2% or ±10,400</w:t>
       </w:r>
     </w:p>
     <w:p>
@@ -1369,7 +1751,31 @@
           <w:sz w:val="24"/>
           <w:szCs w:val="24"/>
         </w:rPr>
-        <w:t>15-1254 (Web Developers) — +13.5% projected change</w:t>
+        <w:t xml:space="preserve">15-1254 (Web Developers) — </w:t>
+      </w:r>
+      <w:r>
+        <w:rPr>
+          <w:rFonts w:cs="Times New Roman" w:ascii="Times New Roman" w:hAnsi="Times New Roman"/>
+          <w:sz w:val="24"/>
+          <w:szCs w:val="24"/>
+        </w:rPr>
+        <w:t>+</w:t>
+      </w:r>
+      <w:r>
+        <w:rPr>
+          <w:rFonts w:cs="Times New Roman" w:ascii="Times New Roman" w:hAnsi="Times New Roman"/>
+          <w:sz w:val="24"/>
+          <w:szCs w:val="24"/>
+        </w:rPr>
+        <w:t>13.5%</w:t>
+      </w:r>
+      <w:r>
+        <w:rPr>
+          <w:rFonts w:cs="Times New Roman" w:ascii="Times New Roman" w:hAnsi="Times New Roman"/>
+          <w:sz w:val="24"/>
+          <w:szCs w:val="24"/>
+        </w:rPr>
+        <w:t xml:space="preserve"> or ±300</w:t>
       </w:r>
     </w:p>
     <w:p>
@@ -1391,7 +1797,31 @@
           <w:sz w:val="24"/>
           <w:szCs w:val="24"/>
         </w:rPr>
-        <w:t>15-1255 (Web and Digital Interface Designers — +11.2% projected change</w:t>
+        <w:t>15-1255 (Web and Digital Interface Designers</w:t>
+      </w:r>
+      <w:r>
+        <w:rPr>
+          <w:rFonts w:cs="Times New Roman" w:ascii="Times New Roman" w:hAnsi="Times New Roman"/>
+          <w:sz w:val="24"/>
+          <w:szCs w:val="24"/>
+        </w:rPr>
+        <w:t>)</w:t>
+      </w:r>
+      <w:r>
+        <w:rPr>
+          <w:rFonts w:cs="Times New Roman" w:ascii="Times New Roman" w:hAnsi="Times New Roman"/>
+          <w:sz w:val="24"/>
+          <w:szCs w:val="24"/>
+        </w:rPr>
+        <w:t xml:space="preserve"> — +11.2% </w:t>
+      </w:r>
+      <w:r>
+        <w:rPr>
+          <w:rFonts w:cs="Times New Roman" w:ascii="Times New Roman" w:hAnsi="Times New Roman"/>
+          <w:sz w:val="24"/>
+          <w:szCs w:val="24"/>
+        </w:rPr>
+        <w:t>or ±300</w:t>
       </w:r>
     </w:p>
     <w:p>
@@ -1413,7 +1843,15 @@
           <w:sz w:val="24"/>
           <w:szCs w:val="24"/>
         </w:rPr>
-        <w:t>27-1014 (Special Effects Artists and Animators) — +0.4% projected change</w:t>
+        <w:t xml:space="preserve">27-1014 (Special Effects Artists and Animators) — +0.4% </w:t>
+      </w:r>
+      <w:r>
+        <w:rPr>
+          <w:rFonts w:cs="Times New Roman" w:ascii="Times New Roman" w:hAnsi="Times New Roman"/>
+          <w:sz w:val="24"/>
+          <w:szCs w:val="24"/>
+        </w:rPr>
+        <w:t>or ±10</w:t>
       </w:r>
     </w:p>
     <w:p>
@@ -1435,7 +1873,15 @@
           <w:sz w:val="24"/>
           <w:szCs w:val="24"/>
         </w:rPr>
-        <w:t>27-1029 (Designers, All Others) — +1.3% projected change</w:t>
+        <w:t xml:space="preserve">27-1029 (Designers, All Others) — +1.3% </w:t>
+      </w:r>
+      <w:r>
+        <w:rPr>
+          <w:rFonts w:cs="Times New Roman" w:ascii="Times New Roman" w:hAnsi="Times New Roman"/>
+          <w:sz w:val="24"/>
+          <w:szCs w:val="24"/>
+        </w:rPr>
+        <w:t>or ±10</w:t>
       </w:r>
     </w:p>
     <w:p>
@@ -1472,7 +1918,7 @@
         </w:rPr>
         <w:t>(</w:t>
       </w:r>
-      <w:hyperlink r:id="rId3">
+      <w:hyperlink r:id="rId2">
         <w:r>
           <w:rPr>
             <w:rStyle w:val="Hyperlink"/>
@@ -1528,25 +1974,6 @@
           <w:szCs w:val="24"/>
           <w:u w:val="single"/>
         </w:rPr>
-      </w:r>
-    </w:p>
-    <w:p>
-      <w:pPr>
-        <w:pStyle w:val="NoSpacing"/>
-        <w:rPr>
-          <w:rFonts w:ascii="Times New Roman" w:hAnsi="Times New Roman" w:cs="Times New Roman"/>
-          <w:sz w:val="24"/>
-          <w:szCs w:val="24"/>
-          <w:u w:val="single"/>
-        </w:rPr>
-      </w:pPr>
-      <w:r>
-        <w:rPr>
-          <w:rFonts w:cs="Times New Roman" w:ascii="Times New Roman" w:hAnsi="Times New Roman"/>
-          <w:sz w:val="24"/>
-          <w:szCs w:val="24"/>
-          <w:u w:val="single"/>
-        </w:rPr>
         <w:t>Duplication with comparable programs of study in the State</w:t>
       </w:r>
     </w:p>
@@ -1600,20 +2027,23 @@
           <w:sz w:val="24"/>
           <w:szCs w:val="24"/>
         </w:rPr>
-        <w:t xml:space="preserve"> of a unified, multidisciplinary curriculum. GRID fills this critical gap by providing a convergent approach that integrates technical programming, aesthetic design, and interactive UX -- a holistic training model that mirrors the actual workflow of the modern interactive media industry.</w:t>
-      </w:r>
-    </w:p>
-    <w:p>
-      <w:pPr>
-        <w:pStyle w:val="Normal"/>
-        <w:rPr>
-          <w:rFonts w:ascii="Times New Roman" w:hAnsi="Times New Roman" w:cs="Times New Roman"/>
-        </w:rPr>
-      </w:pPr>
-      <w:r>
-        <w:rPr>
-          <w:rFonts w:cs="Times New Roman" w:ascii="Times New Roman" w:hAnsi="Times New Roman"/>
-        </w:rPr>
+        <w:t xml:space="preserve"> of a unified, multidisciplinary curriculum. GRID fills this critical gap by providing a convergent approach that integrates technical programming, aesthetic design, and interactive </w:t>
+      </w:r>
+      <w:r>
+        <w:rPr>
+          <w:rFonts w:cs="Times New Roman" w:ascii="Times New Roman" w:hAnsi="Times New Roman"/>
+          <w:sz w:val="24"/>
+          <w:szCs w:val="24"/>
+        </w:rPr>
+        <w:t>user experience</w:t>
+      </w:r>
+      <w:r>
+        <w:rPr>
+          <w:rFonts w:cs="Times New Roman" w:ascii="Times New Roman" w:hAnsi="Times New Roman"/>
+          <w:sz w:val="24"/>
+          <w:szCs w:val="24"/>
+        </w:rPr>
+        <w:t xml:space="preserve"> — a holistic training model that mirrors the actual workflow of the modern interactive media industry.</w:t>
       </w:r>
     </w:p>
     <w:p>
@@ -1688,48 +2118,32 @@
           <w:sz w:val="24"/>
           <w:szCs w:val="24"/>
         </w:rPr>
-        <w:t xml:space="preserve">Because this program integrates three established curricula, it leverages a robust, pre-existing infrastructure. The program is currently supported by three full-time faculty members, two adjunct instructors, two fully equipped computer laboratories, and comprehensive digital systems. Given the projected initial enrollment of 60–70 students and a targeted growth </w:t>
-      </w:r>
-      <w:r>
-        <w:rPr>
-          <w:rFonts w:cs="Times New Roman" w:ascii="Times New Roman" w:hAnsi="Times New Roman"/>
-          <w:sz w:val="24"/>
-          <w:szCs w:val="24"/>
-        </w:rPr>
-        <w:t>between 115-</w:t>
-      </w:r>
-      <w:r>
-        <w:rPr>
-          <w:rFonts w:cs="Times New Roman" w:ascii="Times New Roman" w:hAnsi="Times New Roman"/>
-          <w:sz w:val="24"/>
-          <w:szCs w:val="24"/>
-        </w:rPr>
-        <w:t xml:space="preserve">150 students by year five </w:t>
-      </w:r>
-      <w:r>
-        <w:rPr>
-          <w:rFonts w:cs="Times New Roman" w:ascii="Times New Roman" w:hAnsi="Times New Roman"/>
-          <w:sz w:val="24"/>
-          <w:szCs w:val="24"/>
-        </w:rPr>
-        <w:t>(roughly based on expected job demand increase and appropriate advertising campaigns)</w:t>
-      </w:r>
-      <w:r>
-        <w:rPr>
-          <w:rFonts w:cs="Times New Roman" w:ascii="Times New Roman" w:hAnsi="Times New Roman"/>
-          <w:sz w:val="24"/>
-          <w:szCs w:val="24"/>
-        </w:rPr>
-        <w:t xml:space="preserve"> the program is designed to be self-sustaining within its current resource framework, requiring no significant additional State investment to maintain operational excellence.</w:t>
+        <w:t xml:space="preserve">Because this program integrates three established </w:t>
+      </w:r>
+      <w:r>
+        <w:rPr>
+          <w:rFonts w:cs="Times New Roman" w:ascii="Times New Roman" w:hAnsi="Times New Roman"/>
+          <w:sz w:val="24"/>
+          <w:szCs w:val="24"/>
+        </w:rPr>
+        <w:t>programs</w:t>
+      </w:r>
+      <w:r>
+        <w:rPr>
+          <w:rFonts w:cs="Times New Roman" w:ascii="Times New Roman" w:hAnsi="Times New Roman"/>
+          <w:sz w:val="24"/>
+          <w:szCs w:val="24"/>
+        </w:rPr>
+        <w:t>, it leverages a robust, pre-existing infrastructure. The program is currently supported by three full-time faculty members, two adjunct instructors, two fully equipped computer laboratories, and comprehensive digital systems. Given the projected initial enrollment of 60–70 students and a targeted growth between 115-150 students by year five (roughly based on expected job demand increase and appropriate advertising campaigns) the program is designed to be self-sustaining within its current resource framework, requiring no significant additional State investment to maintain operational excellence.</w:t>
       </w:r>
     </w:p>
     <w:sectPr>
-      <w:headerReference w:type="even" r:id="rId4"/>
-      <w:headerReference w:type="default" r:id="rId5"/>
-      <w:headerReference w:type="first" r:id="rId6"/>
-      <w:footerReference w:type="even" r:id="rId7"/>
-      <w:footerReference w:type="default" r:id="rId8"/>
-      <w:footerReference w:type="first" r:id="rId9"/>
+      <w:headerReference w:type="even" r:id="rId3"/>
+      <w:headerReference w:type="default" r:id="rId4"/>
+      <w:headerReference w:type="first" r:id="rId5"/>
+      <w:footerReference w:type="even" r:id="rId6"/>
+      <w:footerReference w:type="default" r:id="rId7"/>
+      <w:footerReference w:type="first" r:id="rId8"/>
       <w:type w:val="nextPage"/>
       <w:pgSz w:w="12240" w:h="15840"/>
       <w:pgMar w:left="1440" w:right="1440" w:gutter="0" w:header="720" w:top="1440" w:footer="720" w:bottom="1440"/>
@@ -1968,6 +2382,143 @@
   <w:abstractNum w:abstractNumId="2">
     <w:lvl w:ilvl="0">
       <w:start w:val="1"/>
+      <w:numFmt w:val="bullet"/>
+      <w:lvlText w:val=""/>
+      <w:lvlJc w:val="start"/>
+      <w:pPr>
+        <w:tabs>
+          <w:tab w:val="num" w:pos="720"/>
+        </w:tabs>
+        <w:ind w:start="720" w:hanging="360"/>
+      </w:pPr>
+      <w:rPr>
+        <w:rFonts w:ascii="Symbol" w:hAnsi="Symbol" w:cs="Symbol" w:hint="default"/>
+      </w:rPr>
+    </w:lvl>
+    <w:lvl w:ilvl="1">
+      <w:start w:val="1"/>
+      <w:numFmt w:val="bullet"/>
+      <w:lvlText w:val="◦"/>
+      <w:lvlJc w:val="start"/>
+      <w:pPr>
+        <w:tabs>
+          <w:tab w:val="num" w:pos="1080"/>
+        </w:tabs>
+        <w:ind w:start="1080" w:hanging="360"/>
+      </w:pPr>
+      <w:rPr>
+        <w:rFonts w:ascii="OpenSymbol" w:hAnsi="OpenSymbol" w:cs="OpenSymbol" w:hint="default"/>
+      </w:rPr>
+    </w:lvl>
+    <w:lvl w:ilvl="2">
+      <w:start w:val="1"/>
+      <w:numFmt w:val="bullet"/>
+      <w:lvlText w:val="▪"/>
+      <w:lvlJc w:val="start"/>
+      <w:pPr>
+        <w:tabs>
+          <w:tab w:val="num" w:pos="1440"/>
+        </w:tabs>
+        <w:ind w:start="1440" w:hanging="360"/>
+      </w:pPr>
+      <w:rPr>
+        <w:rFonts w:ascii="OpenSymbol" w:hAnsi="OpenSymbol" w:cs="OpenSymbol" w:hint="default"/>
+      </w:rPr>
+    </w:lvl>
+    <w:lvl w:ilvl="3">
+      <w:start w:val="1"/>
+      <w:numFmt w:val="bullet"/>
+      <w:lvlText w:val=""/>
+      <w:lvlJc w:val="start"/>
+      <w:pPr>
+        <w:tabs>
+          <w:tab w:val="num" w:pos="1800"/>
+        </w:tabs>
+        <w:ind w:start="1800" w:hanging="360"/>
+      </w:pPr>
+      <w:rPr>
+        <w:rFonts w:ascii="Symbol" w:hAnsi="Symbol" w:cs="Symbol" w:hint="default"/>
+      </w:rPr>
+    </w:lvl>
+    <w:lvl w:ilvl="4">
+      <w:start w:val="1"/>
+      <w:numFmt w:val="bullet"/>
+      <w:lvlText w:val="◦"/>
+      <w:lvlJc w:val="start"/>
+      <w:pPr>
+        <w:tabs>
+          <w:tab w:val="num" w:pos="2160"/>
+        </w:tabs>
+        <w:ind w:start="2160" w:hanging="360"/>
+      </w:pPr>
+      <w:rPr>
+        <w:rFonts w:ascii="OpenSymbol" w:hAnsi="OpenSymbol" w:cs="OpenSymbol" w:hint="default"/>
+      </w:rPr>
+    </w:lvl>
+    <w:lvl w:ilvl="5">
+      <w:start w:val="1"/>
+      <w:numFmt w:val="bullet"/>
+      <w:lvlText w:val="▪"/>
+      <w:lvlJc w:val="start"/>
+      <w:pPr>
+        <w:tabs>
+          <w:tab w:val="num" w:pos="2520"/>
+        </w:tabs>
+        <w:ind w:start="2520" w:hanging="360"/>
+      </w:pPr>
+      <w:rPr>
+        <w:rFonts w:ascii="OpenSymbol" w:hAnsi="OpenSymbol" w:cs="OpenSymbol" w:hint="default"/>
+      </w:rPr>
+    </w:lvl>
+    <w:lvl w:ilvl="6">
+      <w:start w:val="1"/>
+      <w:numFmt w:val="bullet"/>
+      <w:lvlText w:val=""/>
+      <w:lvlJc w:val="start"/>
+      <w:pPr>
+        <w:tabs>
+          <w:tab w:val="num" w:pos="2880"/>
+        </w:tabs>
+        <w:ind w:start="2880" w:hanging="360"/>
+      </w:pPr>
+      <w:rPr>
+        <w:rFonts w:ascii="Symbol" w:hAnsi="Symbol" w:cs="Symbol" w:hint="default"/>
+      </w:rPr>
+    </w:lvl>
+    <w:lvl w:ilvl="7">
+      <w:start w:val="1"/>
+      <w:numFmt w:val="bullet"/>
+      <w:lvlText w:val="◦"/>
+      <w:lvlJc w:val="start"/>
+      <w:pPr>
+        <w:tabs>
+          <w:tab w:val="num" w:pos="3240"/>
+        </w:tabs>
+        <w:ind w:start="3240" w:hanging="360"/>
+      </w:pPr>
+      <w:rPr>
+        <w:rFonts w:ascii="OpenSymbol" w:hAnsi="OpenSymbol" w:cs="OpenSymbol" w:hint="default"/>
+      </w:rPr>
+    </w:lvl>
+    <w:lvl w:ilvl="8">
+      <w:start w:val="1"/>
+      <w:numFmt w:val="bullet"/>
+      <w:lvlText w:val="▪"/>
+      <w:lvlJc w:val="start"/>
+      <w:pPr>
+        <w:tabs>
+          <w:tab w:val="num" w:pos="3600"/>
+        </w:tabs>
+        <w:ind w:start="3600" w:hanging="360"/>
+      </w:pPr>
+      <w:rPr>
+        <w:rFonts w:ascii="OpenSymbol" w:hAnsi="OpenSymbol" w:cs="OpenSymbol" w:hint="default"/>
+      </w:rPr>
+    </w:lvl>
+  </w:abstractNum>
+  <w:abstractNum w:abstractNumId="3">
+    <w:lvl w:ilvl="0">
+      <w:start w:val="1"/>
       <w:numFmt w:val="none"/>
       <w:suff w:val="nothing"/>
       <w:lvlText w:val=""/>
@@ -2089,6 +2640,9 @@
   </w:num>
   <w:num w:numId="2">
     <w:abstractNumId w:val="2"/>
+  </w:num>
+  <w:num w:numId="3">
+    <w:abstractNumId w:val="3"/>
   </w:num>
 </w:numbering>
 </file>
@@ -2572,6 +3126,13 @@
     <w:rPr>
       <w:color w:val="000080"/>
       <w:u w:val="single"/>
+    </w:rPr>
+  </w:style>
+  <w:style w:type="character" w:styleId="Bulletsuser">
+    <w:name w:val="Bullets (user)"/>
+    <w:qFormat/>
+    <w:rPr>
+      <w:rFonts w:ascii="OpenSymbol" w:hAnsi="OpenSymbol" w:eastAsia="OpenSymbol" w:cs="OpenSymbol"/>
     </w:rPr>
   </w:style>
   <w:style w:type="character" w:styleId="Bullets">

</xml_diff>